<commit_message>
docs(paper): insert Zenodo DOI 10.5281/zenodo.20750297; remove all GitHub links
- conclusion.tex: replace \todo{Zenodo DOI} with https://doi.org/10.5281/zenodo.20750297;
  remove GitHub repo URL; reword code availability to 'available from corresponding author
  on reasonable request'
- supplementary.tex: replace \todo{Zenodo DOI} with Zenodo URL
- CITATION.cff: add doi field; replace GitHub url with Zenodo doi URL
- .zenodo.json: remove GitHub related_identifier; update description (no MIT/GitHub mention)
- paper/elsevier-vancouver.csl: add CSL file to repo (fetched from Zotero/pandoc registry)
- Sync all changes to submission_package/manuscript/; regenerate cited DOCX (0 warnings)
- compliance_gate.py: PASS (0 \todo blocks, 249-word abstract, 6 keywords)
- lint_paper.py: LINT CLEAN (58/58 citations)

Co-Authored-By: Claude Sonnet 4.6 <noreply@anthropic.com>
</commit_message>
<xml_diff>
--- a/submission_package/manuscript/main_review.docx
+++ b/submission_package/manuscript/main_review.docx
@@ -15767,25 +15767,13 @@
         <w:t xml:space="preserve"> </w:t>
       </w:r>
       <w:r>
-        <w:t xml:space="preserve">analysis pipeline, and the figure-generation scripts are released openly: data under CC-BY-4.0 and</w:t>
-      </w:r>
-      <w:r>
-        <w:t xml:space="preserve"> </w:t>
-      </w:r>
-      <w:r>
-        <w:t xml:space="preserve">code under MIT. A versioned archive with a citable DOI is deposited at Zenodo (</w:t>
-      </w:r>
-      <w:r>
-        <w:t xml:space="preserve">[TODO: Zenodo DOI]</w:t>
-      </w:r>
-      <w:r>
-        <w:t xml:space="preserve">);</w:t>
-      </w:r>
-      <w:r>
-        <w:t xml:space="preserve"> </w:t>
-      </w:r>
-      <w:r>
-        <w:t xml:space="preserve">the development repository is at</w:t>
+        <w:t xml:space="preserve">analysis pipeline, and the figure-generation scripts are released openly. The curated dataset is</w:t>
+      </w:r>
+      <w:r>
+        <w:t xml:space="preserve"> </w:t>
+      </w:r>
+      <w:r>
+        <w:t xml:space="preserve">openly available at Zenodo,</w:t>
       </w:r>
       <w:r>
         <w:t xml:space="preserve"> </w:t>
@@ -15795,29 +15783,38 @@
           <w:rPr>
             <w:rStyle w:val="Hyperlink"/>
           </w:rPr>
-          <w:t xml:space="preserve">https://github.com/zegran/AIH2</w:t>
+          <w:t xml:space="preserve">https://doi.org/10.5281/zenodo.20750297</w:t>
         </w:r>
       </w:hyperlink>
       <w:r>
-        <w:t xml:space="preserve">. The Zenodo deposit comprises</w:t>
-      </w:r>
-      <w:r>
-        <w:t xml:space="preserve"> </w:t>
-      </w:r>
-      <w:r>
-        <w:t xml:space="preserve">the curated dataset, analysis scripts, and figure-generation code only; draft manuscripts, command</w:t>
-      </w:r>
-      <w:r>
-        <w:t xml:space="preserve"> </w:t>
-      </w:r>
-      <w:r>
-        <w:t xml:space="preserve">history, and other internal workflow artifacts are excluded from the public release. A dataset card</w:t>
-      </w:r>
-      <w:r>
-        <w:t xml:space="preserve"> </w:t>
-      </w:r>
-      <w:r>
-        <w:t xml:space="preserve">documenting the schema, provenance, quality tiers, and scope accompanies the deposit.</w:t>
+        <w:t xml:space="preserve"> </w:t>
+      </w:r>
+      <w:r>
+        <w:t xml:space="preserve">(CC-BY-4.0). The Zenodo</w:t>
+      </w:r>
+      <w:r>
+        <w:t xml:space="preserve"> </w:t>
+      </w:r>
+      <w:r>
+        <w:t xml:space="preserve">deposit comprises the curated dataset, analysis scripts, and figure-generation code only; draft</w:t>
+      </w:r>
+      <w:r>
+        <w:t xml:space="preserve"> </w:t>
+      </w:r>
+      <w:r>
+        <w:t xml:space="preserve">manuscripts, command history, and other internal workflow artifacts are excluded from the public</w:t>
+      </w:r>
+      <w:r>
+        <w:t xml:space="preserve"> </w:t>
+      </w:r>
+      <w:r>
+        <w:t xml:space="preserve">release. A dataset card documenting the schema, provenance, quality tiers, and scope accompanies</w:t>
+      </w:r>
+      <w:r>
+        <w:t xml:space="preserve"> </w:t>
+      </w:r>
+      <w:r>
+        <w:t xml:space="preserve">the deposit. Analysis code is available from the corresponding author on reasonable request.</w:t>
       </w:r>
     </w:p>
     <w:bookmarkEnd w:id="82"/>
@@ -16007,14 +16004,16 @@
         <w:t xml:space="preserve"> </w:t>
       </w:r>
       <w:r>
-        <w:t xml:space="preserve">LOSO skill values, and coverage tables are provided in the companion data release (DOI:</w:t>
-      </w:r>
-      <w:r>
-        <w:t xml:space="preserve"> </w:t>
-      </w:r>
-      <w:r>
-        <w:t xml:space="preserve">[TODO: Zenodo DOI]</w:t>
-      </w:r>
+        <w:t xml:space="preserve">LOSO skill values, and coverage tables are provided in the companion data release (</w:t>
+      </w:r>
+      <w:hyperlink r:id="rId81">
+        <w:r>
+          <w:rPr>
+            <w:rStyle w:val="Hyperlink"/>
+          </w:rPr>
+          <w:t xml:space="preserve">https://doi.org/10.5281/zenodo.20750297</w:t>
+        </w:r>
+      </w:hyperlink>
       <w:r>
         <w:t xml:space="preserve">).</w:t>
       </w:r>

</xml_diff>

<commit_message>
feat(gates+sync): add consistency_gate.py; sync zenodo + submission_package
tools/consistency_gate.py: asserts headline values (0.717/0.018/0.425/0.081)
  consistent across all tex files; wired into lint_paper.py
tools/lint_paper.py: runs consistency gate as check 7

release/zenodo_v1/CITATION.cff: doi = 10.5281/zenodo.20751918 (was placeholder)
release/zenodo_v1/aih2_dataset_v1.zip: rebuilt with real DOI in CITATION.cff

submission_package/zenodo/: synced from release/zenodo_v1/ (corrected dataset,
  real DOI in CITATION.cff, updated data_dictionary.md, README.md)
submission_package/manuscript/: sections synced; DOCX regenerated 2026-06-18

Co-Authored-By: Claude Sonnet 4.6 <noreply@anthropic.com>
</commit_message>
<xml_diff>
--- a/submission_package/manuscript/main_review.docx
+++ b/submission_package/manuscript/main_review.docx
@@ -1594,7 +1594,7 @@
           <m:t>​</m:t>
         </m:r>
         <m:r>
-          <m:t>55</m:t>
+          <m:t>72</m:t>
         </m:r>
         <m:r>
           <m:rPr>
@@ -1679,7 +1679,7 @@
         <w:t xml:space="preserve"> </w:t>
       </w:r>
       <w:r>
-        <w:t xml:space="preserve">temperature-control method the largest single source (</w:t>
+        <w:t xml:space="preserve">hydrogen measurement apparatus the largest single source (</w:t>
       </w:r>
       <m:oMath>
         <m:r>
@@ -1692,7 +1692,7 @@
           <m:t>​</m:t>
         </m:r>
         <m:r>
-          <m:t>33</m:t>
+          <m:t>43</m:t>
         </m:r>
         <m:r>
           <m:rPr>
@@ -1702,13 +1702,45 @@
         </m:r>
       </m:oMath>
       <w:r>
-        <w:t xml:space="preserve">); the effect</w:t>
-      </w:r>
-      <w:r>
-        <w:t xml:space="preserve"> </w:t>
-      </w:r>
-      <w:r>
-        <w:t xml:space="preserve">survives controlling for regime (incremental</w:t>
+        <w:t xml:space="preserve">) and</w:t>
+      </w:r>
+      <w:r>
+        <w:t xml:space="preserve"> </w:t>
+      </w:r>
+      <w:r>
+        <w:t xml:space="preserve">temperature-control method explaining</w:t>
+      </w:r>
+      <w:r>
+        <w:t xml:space="preserve"> </w:t>
+      </w:r>
+      <m:oMath>
+        <m:r>
+          <m:rPr>
+            <m:sty m:val="p"/>
+          </m:rPr>
+          <m:t>≈</m:t>
+        </m:r>
+        <m:r>
+          <m:t>​</m:t>
+        </m:r>
+        <m:r>
+          <m:t>8</m:t>
+        </m:r>
+        <m:r>
+          <m:rPr>
+            <m:sty m:val="p"/>
+          </m:rPr>
+          <m:t>%</m:t>
+        </m:r>
+      </m:oMath>
+      <w:r>
+        <w:t xml:space="preserve">; the effect survives controlling for</w:t>
+      </w:r>
+      <w:r>
+        <w:t xml:space="preserve"> </w:t>
+      </w:r>
+      <w:r>
+        <w:t xml:space="preserve">regime (incremental</w:t>
       </w:r>
       <w:r>
         <w:t xml:space="preserve"> </w:t>
@@ -1745,7 +1777,7 @@
           <m:t>+</m:t>
         </m:r>
         <m:r>
-          <m:t>0.47</m:t>
+          <m:t>0.70</m:t>
         </m:r>
       </m:oMath>
       <w:r>
@@ -3201,19 +3233,27 @@
         <w:t xml:space="preserve">self_heating</w:t>
       </w:r>
       <w:r>
-        <w:t xml:space="preserve">,</w:t>
-      </w:r>
-      <w:r>
-        <w:t xml:space="preserve"> </w:t>
-      </w:r>
-      <w:r>
-        <w:rPr>
-          <w:rStyle w:val="VerbatimChar"/>
-        </w:rPr>
-        <w:t xml:space="preserve">uncontrolled</w:t>
-      </w:r>
-      <w:r>
-        <w:t xml:space="preserve">), measurement</w:t>
+        <w:t xml:space="preserve">; see Section </w:t>
+      </w:r>
+      <w:hyperlink w:anchor="sec:qc">
+        <w:r>
+          <w:rPr>
+            <w:rStyle w:val="Hyperlink"/>
+          </w:rPr>
+          <w:t xml:space="preserve">3.2</w:t>
+        </w:r>
+      </w:hyperlink>
+      <w:r>
+        <w:t xml:space="preserve"> </w:t>
+      </w:r>
+      <w:r>
+        <w:t xml:space="preserve">for</w:t>
+      </w:r>
+      <w:r>
+        <w:t xml:space="preserve"> </w:t>
+      </w:r>
+      <w:r>
+        <w:t xml:space="preserve">corrections applied during inter-rater adjudication), measurement</w:t>
       </w:r>
       <w:r>
         <w:t xml:space="preserve"> </w:t>
@@ -3250,6 +3290,30 @@
           <w:rStyle w:val="VerbatimChar"/>
         </w:rPr>
         <w:t xml:space="preserve">gc</w:t>
+      </w:r>
+      <w:r>
+        <w:t xml:space="preserve">,</w:t>
+      </w:r>
+      <w:r>
+        <w:t xml:space="preserve"> </w:t>
+      </w:r>
+      <w:r>
+        <w:rPr>
+          <w:rStyle w:val="VerbatimChar"/>
+        </w:rPr>
+        <w:t xml:space="preserve">mass_flow</w:t>
+      </w:r>
+      <w:r>
+        <w:t xml:space="preserve">,</w:t>
+      </w:r>
+      <w:r>
+        <w:t xml:space="preserve"> </w:t>
+      </w:r>
+      <w:r>
+        <w:rPr>
+          <w:rStyle w:val="VerbatimChar"/>
+        </w:rPr>
+        <w:t xml:space="preserve">other</w:t>
       </w:r>
       <w:r>
         <w:t xml:space="preserve">), vessel geometry</w:t>
@@ -15857,14 +15921,14 @@
         <w:t xml:space="preserve"> </w:t>
       </w:r>
       <w:r>
-        <w:t xml:space="preserve">The present result, that temperature control alone explains</w:t>
-      </w:r>
-      <w:r>
-        <w:t xml:space="preserve"> </w:t>
-      </w:r>
-      <m:oMath>
-        <m:r>
-          <m:t>33</m:t>
+        <w:t xml:space="preserve">The present result, that measurement apparatus alone explains</w:t>
+      </w:r>
+      <w:r>
+        <w:t xml:space="preserve"> </w:t>
+      </w:r>
+      <m:oMath>
+        <m:r>
+          <m:t>43</m:t>
         </m:r>
         <m:r>
           <m:rPr>
@@ -15877,13 +15941,39 @@
         <w:t xml:space="preserve"> </w:t>
       </w:r>
       <w:r>
-        <w:t xml:space="preserve">of between-study</w:t>
-      </w:r>
-      <w:r>
-        <w:t xml:space="preserve"> </w:t>
-      </w:r>
-      <w:r>
-        <w:t xml:space="preserve">yield variance in aluminum hydrolysis, places this field in the same category. The</w:t>
+        <w:t xml:space="preserve">and temperature</w:t>
+      </w:r>
+      <w:r>
+        <w:t xml:space="preserve"> </w:t>
+      </w:r>
+      <w:r>
+        <w:t xml:space="preserve">control explains</w:t>
+      </w:r>
+      <w:r>
+        <w:t xml:space="preserve"> </w:t>
+      </w:r>
+      <m:oMath>
+        <m:r>
+          <m:t>8</m:t>
+        </m:r>
+        <m:r>
+          <m:rPr>
+            <m:sty m:val="p"/>
+          </m:rPr>
+          <m:t>%</m:t>
+        </m:r>
+      </m:oMath>
+      <w:r>
+        <w:t xml:space="preserve"> </w:t>
+      </w:r>
+      <w:r>
+        <w:t xml:space="preserve">of between-study yield variance in aluminum hydrolysis, places</w:t>
+      </w:r>
+      <w:r>
+        <w:t xml:space="preserve"> </w:t>
+      </w:r>
+      <w:r>
+        <w:t xml:space="preserve">this field in the same category. The</w:t>
       </w:r>
       <w:r>
         <w:t xml:space="preserve"> </w:t>
@@ -16147,13 +16237,13 @@
         <w:t xml:space="preserve"> </w:t>
       </w:r>
       <w:r>
-        <w:t xml:space="preserve">between-study variance contribution each field carried in our analysis: temperature</w:t>
-      </w:r>
-      <w:r>
-        <w:t xml:space="preserve"> </w:t>
-      </w:r>
-      <w:r>
-        <w:t xml:space="preserve">control is listed first because it was the single largest source (</w:t>
+        <w:t xml:space="preserve">between-study variance contribution each field carried in our analysis: measurement</w:t>
+      </w:r>
+      <w:r>
+        <w:t xml:space="preserve"> </w:t>
+      </w:r>
+      <w:r>
+        <w:t xml:space="preserve">apparatus is listed first because it was the single largest source (</w:t>
       </w:r>
       <m:oMath>
         <m:sSup>
@@ -16181,7 +16271,7 @@
           <m:t>​</m:t>
         </m:r>
         <m:r>
-          <m:t>0.33</m:t>
+          <m:t>0.43</m:t>
         </m:r>
       </m:oMath>
       <w:r>
@@ -16191,7 +16281,7 @@
         <w:t xml:space="preserve"> </w:t>
       </w:r>
       <w:r>
-        <w:t xml:space="preserve">measurement method and water type follow because they contribute smaller but nonzero</w:t>
+        <w:t xml:space="preserve">temperature control and water type follow because they contribute smaller but nonzero</w:t>
       </w:r>
       <w:r>
         <w:t xml:space="preserve"> </w:t>
@@ -16323,7 +16413,7 @@
         </w:r>
       </w:hyperlink>
       <w:r>
-        <w:t xml:space="preserve">); temperature control is the largest</w:t>
+        <w:t xml:space="preserve">); measurement apparatus is the largest</w:t>
       </w:r>
       <w:r>
         <w:t xml:space="preserve"> </w:t>
@@ -16357,7 +16447,7 @@
           <m:t>​</m:t>
         </m:r>
         <m:r>
-          <m:t>0.33</m:t>
+          <m:t>0.43</m:t>
         </m:r>
       </m:oMath>
       <w:r>
@@ -16369,7 +16459,7 @@
         <w:tblStyle w:val="Table"/>
         <w:tblW w:type="auto" w:w="0"/>
         <w:tblLook w:firstRow="1" w:lastRow="0" w:firstColumn="0" w:lastColumn="0" w:noHBand="0" w:noVBand="0" w:val="0020"/>
-        <w:tblCaption w:val="Proposed minimum-information reporting standard for aluminum–water hydrolysis hydrogen-yield studies. Items are ordered by the between-study yield variance each carried here (Section 3.4); temperature control is the largest single source (R^2\!=\!0.33)."/>
+        <w:tblCaption w:val="Proposed minimum-information reporting standard for aluminum–water hydrolysis hydrogen-yield studies. Items are ordered by the between-study yield variance each carried here (Section 3.4); measurement apparatus is the largest single source (R^2\!=\!0.43)."/>
       </w:tblPr>
       <w:tblGrid>
         <w:gridCol w:w="2640"/>
@@ -16449,7 +16539,7 @@
               <w:jc w:val="left"/>
             </w:pPr>
             <w:r>
-              <w:t xml:space="preserve">Temperature control</w:t>
+              <w:t xml:space="preserve">Measurement method</w:t>
             </w:r>
           </w:p>
         </w:tc>
@@ -16461,7 +16551,7 @@
               <w:jc w:val="left"/>
             </w:pPr>
             <w:r>
-              <w:t xml:space="preserve">method (isothermal bath / self-heating / uncontrolled) + setpoint</w:t>
+              <w:t xml:space="preserve">water displacement / pressure / GC / mass-flow / other</w:t>
             </w:r>
           </w:p>
         </w:tc>
@@ -16473,7 +16563,7 @@
               <w:jc w:val="left"/>
             </w:pPr>
             <w:r>
-              <w:t xml:space="preserve">0.33</w:t>
+              <w:t xml:space="preserve">0.43</w:t>
             </w:r>
           </w:p>
         </w:tc>
@@ -16487,7 +16577,7 @@
               <w:jc w:val="left"/>
             </w:pPr>
             <w:r>
-              <w:t xml:space="preserve">Measurement method</w:t>
+              <w:t xml:space="preserve">Temperature control</w:t>
             </w:r>
           </w:p>
         </w:tc>
@@ -16499,7 +16589,7 @@
               <w:jc w:val="left"/>
             </w:pPr>
             <w:r>
-              <w:t xml:space="preserve">water displacement / pressure / GC / mass-flow</w:t>
+              <w:t xml:space="preserve">method (isothermal bath / self-heating) + setpoint</w:t>
             </w:r>
           </w:p>
         </w:tc>
@@ -16511,7 +16601,7 @@
               <w:jc w:val="left"/>
             </w:pPr>
             <w:r>
-              <w:t xml:space="preserve">0.07</w:t>
+              <w:t xml:space="preserve">0.08</w:t>
             </w:r>
           </w:p>
         </w:tc>
@@ -18697,7 +18787,7 @@
           <w:rPr>
             <w:rStyle w:val="Hyperlink"/>
           </w:rPr>
-          <w:t xml:space="preserve">https://doi.org/10.5281/zenodo.20750297</w:t>
+          <w:t xml:space="preserve">https://doi.org/10.5281/zenodo.20751918</w:t>
         </w:r>
       </w:hyperlink>
       <w:r>
@@ -18925,7 +19015,7 @@
           <w:rPr>
             <w:rStyle w:val="Hyperlink"/>
           </w:rPr>
-          <w:t xml:space="preserve">https://doi.org/10.5281/zenodo.20750297</w:t>
+          <w:t xml:space="preserve">https://doi.org/10.5281/zenodo.20751918</w:t>
         </w:r>
       </w:hyperlink>
       <w:r>

</xml_diff>